<commit_message>
Fix SMK contrato_faturado: remove hardcoded R$,00 around IMOBILIARIA
Template had "sendo R$[blank],00 para «IMOBILIARIA» e R$[blank],00 para ,"
with hardcoded run fragments. Replaced with "sendo «IMOBILIARIA»," so
montarImobiliaria() output fits naturally into the clause.

https://claude.ai/code/session_01L1sfwnXz59t3NvQDJuRWQR
</commit_message>
<xml_diff>
--- a/template/supabase-files/SMK contrato_faturado.docx
+++ b/template/supabase-files/SMK contrato_faturado.docx
@@ -5807,28 +5807,7 @@
                 <w:rFonts w:asciiTheme="minorHAnsi" w:hAnsiTheme="minorHAnsi" w:cstheme="minorHAnsi"/>
                 <w:color w:val="000000"/>
               </w:rPr>
-              <w:t>, ser parte integrante do Preço, esta tem conhecimento de que o serviço de intermediação imobiliária para aquisição da Unidade Autônoma foi prestado por empresa(s) especializada(s), sendo R$</w:t>
-            </w:r>
-            <w:r>
-              <w:rPr>
-                <w:rFonts w:asciiTheme="minorHAnsi" w:hAnsiTheme="minorHAnsi" w:cstheme="minorHAnsi"/>
-                <w:color w:val="000000"/>
-              </w:rPr>
-              <w:t xml:space="preserve">,00 </w:t>
-            </w:r>
-            <w:r>
-              <w:rPr>
-                <w:rFonts w:asciiTheme="minorHAnsi" w:hAnsiTheme="minorHAnsi" w:cstheme="minorHAnsi"/>
-                <w:color w:val="000000"/>
-              </w:rPr>
-              <w:t>para</w:t>
-            </w:r>
-            <w:r>
-              <w:rPr>
-                <w:rFonts w:asciiTheme="minorHAnsi" w:hAnsiTheme="minorHAnsi" w:cstheme="minorHAnsi"/>
-                <w:color w:val="000000"/>
-              </w:rPr>
-              <w:t xml:space="preserve"> </w:t>
+              <w:t>, ser parte integrante do Preço, esta tem conhecimento de que o serviço de intermediação imobiliária para aquisição da Unidade Autônoma foi prestado por empresa(s) especializada(s), sendo </w:t>
             </w:r>
             <w:r>
               <w:rPr>
@@ -5836,27 +5815,6 @@
                 <w:color w:val="000000"/>
               </w:rPr>
               <w:t>«IMOBILIARIA»</w:t>
-            </w:r>
-            <w:r>
-              <w:rPr>
-                <w:rFonts w:asciiTheme="minorHAnsi" w:hAnsiTheme="minorHAnsi" w:cstheme="minorHAnsi"/>
-                <w:color w:val="000000"/>
-              </w:rPr>
-              <w:t xml:space="preserve"> </w:t>
-            </w:r>
-            <w:r>
-              <w:rPr>
-                <w:rFonts w:asciiTheme="minorHAnsi" w:hAnsiTheme="minorHAnsi" w:cstheme="minorHAnsi"/>
-                <w:color w:val="000000"/>
-              </w:rPr>
-              <w:t>e R$</w:t>
-            </w:r>
-            <w:r>
-              <w:rPr>
-                <w:rFonts w:asciiTheme="minorHAnsi" w:hAnsiTheme="minorHAnsi" w:cstheme="minorHAnsi"/>
-                <w:color w:val="000000"/>
-              </w:rPr>
-              <w:t xml:space="preserve">,00 para </w:t>
             </w:r>
             <w:r>
               <w:rPr>

</xml_diff>